<commit_message>
Therapietrouw: nacht geschat als het toestel 's nachts af is; CMFO-onderlaag microkurk of EVA shore 50 in eCRF 10, 23 en REDCap; redactionele snoei
- stap 1: geen liggen 's nachts en toestel af -> nacht = tijd tussen laatste en eerste gemeten periode (slapengaan na 20 u, opstaan 4-12 u, niet-gedragen tijd dekt de nacht); zulke dagen staan als geschat, met waarschuwing
- eCRF 10 en 23 (alle mappen), REDCap e10_basis en e23_a1_maat, BRONNEN en CLAUDE.md volgen het deck van 12/10: microkurk of EVA shore 50; toegelaten schoeisel in BRONNEN en CLAUDE.md
- handleidingen: herhaling weg (blok eindpunt en mediator, CMFO-chips, kolom afname door); patientenpagina: MoveMonitor een keer uitgelegd, FAQ over GPS weg (staat al in de sensorkaart)
- oud voorbeeldblad PARADISE_Feedback_Draagpatroon_20feb-3apr2026.html verwijderd
- offline pakket opnieuw gebouwd; tests voor de geschatte nacht

Co-Authored-By: Claude Opus 5.5 <noreply@anthropic.com>
</commit_message>
<xml_diff>
--- a/(e)CRF/Per nummer/10_Voorschrift aangepaste voetorthese (CMFO).docx
+++ b/(e)CRF/Per nummer/10_Voorschrift aangepaste voetorthese (CMFO).docx
@@ -1184,7 +1184,7 @@
           <w:color w:val="24303B"/>
           <w:lang w:val="nl-NL"/>
         </w:rPr>
-        <w:t>: In een volledig op maat gemaakte schoen dient deze te bestaan uit 5 mm dik microkurk (</w:t>
+        <w:t>: In een volledig op maat gemaakte schoen dient deze te bestaan uit 5 mm dik microkurk of EVA shore 50</w:t>
       </w:r>
       <w:proofErr w:type="spellStart"/>
       <w:r>
@@ -1192,7 +1192,6 @@
           <w:color w:val="24303B"/>
           <w:lang w:val="nl-NL"/>
         </w:rPr>
-        <w:t>shore</w:t>
       </w:r>
       <w:proofErr w:type="spellEnd"/>
       <w:r>
@@ -1200,7 +1199,7 @@
           <w:color w:val="24303B"/>
           <w:lang w:val="nl-NL"/>
         </w:rPr>
-        <w:t xml:space="preserve"> 55), met daarbovenop 5 mm dik Ethyleen Vinyl Acetaat (EVA) (</w:t>
+        <w:t>, met daarbovenop 5 mm dik Ethyleen Vinyl Acetaat (EVA) (</w:t>
       </w:r>
       <w:proofErr w:type="spellStart"/>
       <w:r>

</xml_diff>